<commit_message>
Atualiza escopo do projeto (cadastro multi-item e sinalização PNCP)
Registra a execução de dois gaps da Tela 2/Tela 4 e documenta por que
os outros dois (upload de documento, filtro "precisa da sua ação")
ficaram parados aguardando decisão do usuário em vez de serem
construídos com uma suposição minha.

Co-Authored-By: Claude Sonnet 5 <noreply@anthropic.com>
Claude-Session: https://claude.ai/code/session_01PrnhzdCBtHafogpqn4hpiw
</commit_message>
<xml_diff>
--- a/ESCOPO-DO-PROJETO.docx
+++ b/ESCOPO-DO-PROJETO.docx
@@ -1697,23 +1697,23 @@
           </w:tcPr>
           <w:p>
             <w:r>
-              <w:t xml:space="preserve">Cadastro de nova ata</w:t>
-            </w:r>
-          </w:p>
-        </w:tc>
-        <w:tc>
-          <w:tcPr>
-            <w:tcW w:type="dxa" w:w="3000"/>
-            <w:tcMar>
-              <w:top w:type="dxa" w:w="80"/>
-              <w:left w:type="dxa" w:w="100"/>
-              <w:bottom w:type="dxa" w:w="80"/>
-              <w:right w:type="dxa" w:w="100"/>
-            </w:tcMar>
-          </w:tcPr>
-          <w:p>
-            <w:r>
-              <w:t xml:space="preserve">🟡 Funciona, mas só 1 item por ata (ver gap)</w:t>
+              <w:t xml:space="preserve">Cadastro de nova ata (N itens)</w:t>
+            </w:r>
+          </w:p>
+        </w:tc>
+        <w:tc>
+          <w:tcPr>
+            <w:tcW w:type="dxa" w:w="3000"/>
+            <w:tcMar>
+              <w:top w:type="dxa" w:w="80"/>
+              <w:left w:type="dxa" w:w="100"/>
+              <w:bottom w:type="dxa" w:w="80"/>
+              <w:right w:type="dxa" w:w="100"/>
+            </w:tcMar>
+          </w:tcPr>
+          <w:p>
+            <w:r>
+              <w:t xml:space="preserve">✅ Completo</w:t>
             </w:r>
           </w:p>
         </w:tc>
@@ -1812,6 +1812,34 @@
     </w:p>
     <w:p>
       <w:pPr>
+        <w:pStyle w:val="ListParagraph"/>
+        <w:numPr>
+          <w:ilvl w:val="0"/>
+          <w:numId w:val="1"/>
+        </w:numPr>
+        <w:spacing w:after="60"/>
+      </w:pPr>
+      <w:r>
+        <w:rPr>
+          <w:b/>
+          <w:bCs/>
+        </w:rPr>
+        <w:t xml:space="preserve">Cadastro de ata com múltiplos itens de uma vez</w:t>
+      </w:r>
+      <w:r>
+        <w:t xml:space="preserve"> (2026-09-04) — o</w:t>
+      </w:r>
+    </w:p>
+    <w:p>
+      <w:pPr>
+        <w:spacing w:after="150"/>
+      </w:pPr>
+      <w:r>
+        <w:t xml:space="preserve">  formulário agora tem "+ Adicionar item" (e "Remover" por bloco, exceto   quando só resta 1), enviando a lista inteira via `FormData.getAll` com   campos `itemDescricao[]`/`itemCategoria[]`/`itemUnidade[]`/   `itemQuantidade[]`/`itemValorUnitario[]`. A ação valida que todos os   arrays têm o mesmo tamanho e cada item é válido, e cria a ata com todos   os itens num único `prisma.ata.create`. Verificado ao vivo com   Playwright (3 itens numa mesma ata, todos apareceram na página de   detalhe).</w:t>
+      </w:r>
+    </w:p>
+    <w:p>
+      <w:pPr>
         <w:pStyle w:val="Heading2"/>
         <w:spacing w:after="100" w:before="200"/>
       </w:pPr>
@@ -1833,54 +1861,6 @@
           <w:b/>
           <w:bCs/>
         </w:rPr>
-        <w:t xml:space="preserve">Cadastro de ata com múltiplos itens de uma vez.</w:t>
-      </w:r>
-      <w:r>
-        <w:t xml:space="preserve"> Achado da revisão</w:t>
-      </w:r>
-    </w:p>
-    <w:p>
-      <w:pPr>
-        <w:spacing w:after="150"/>
-      </w:pPr>
-      <w:r>
-        <w:t xml:space="preserve">  de telas (Prompt 1, 2026-09-04): o formulário hoje só tem </w:t>
-      </w:r>
-      <w:r>
-        <w:rPr>
-          <w:b/>
-          <w:bCs/>
-        </w:rPr>
-        <w:t xml:space="preserve">uma</w:t>
-      </w:r>
-      <w:r>
-        <w:t xml:space="preserve"> seção   de item fixa — sem "adicionar outro item". Toda ata cadastrada por esse   formulário sai com exatamente 1 item, mesmo o schema suportando N   (`Ata.itens: Item[]` já é um-para-muitos de verdade — a prova é o seed,   que cria atas com 2+ itens direto no banco). </w:t>
-      </w:r>
-      <w:r>
-        <w:rPr>
-          <w:b/>
-          <w:bCs/>
-        </w:rPr>
-        <w:t xml:space="preserve">Este é o gap mais   importante da Tela 2</w:t>
-      </w:r>
-      <w:r>
-        <w:t xml:space="preserve"> — sem ele, toda ata real cadastrada por   fornecedor continuará chegando com 1 item só, o que não representa o   caso real (atas de 200-541 itens, como a de medicamentos mencionada).</w:t>
-      </w:r>
-    </w:p>
-    <w:p>
-      <w:pPr>
-        <w:pStyle w:val="ListParagraph"/>
-        <w:numPr>
-          <w:ilvl w:val="0"/>
-          <w:numId w:val="1"/>
-        </w:numPr>
-        <w:spacing w:after="60"/>
-      </w:pPr>
-      <w:r>
-        <w:rPr>
-          <w:b/>
-          <w:bCs/>
-        </w:rPr>
         <w:t xml:space="preserve">Upload de documento</w:t>
       </w:r>
       <w:r>
@@ -1892,28 +1872,30 @@
         <w:spacing w:after="150"/>
       </w:pPr>
       <w:r>
-        <w:t xml:space="preserve">  cadastro é só formulário de texto, sem anexo.</w:t>
-      </w:r>
-    </w:p>
-    <w:p>
-      <w:pPr>
-        <w:pStyle w:val="ListParagraph"/>
-        <w:numPr>
-          <w:ilvl w:val="0"/>
-          <w:numId w:val="1"/>
-        </w:numPr>
-        <w:spacing w:after="60"/>
-      </w:pPr>
-      <w:r>
-        <w:t xml:space="preserve">Nenhum gap adicional foi levantado ainda pro restante do painel do</w:t>
-      </w:r>
-    </w:p>
-    <w:p>
-      <w:pPr>
-        <w:spacing w:after="150"/>
-      </w:pPr>
-      <w:r>
-        <w:t xml:space="preserve">  fornecedor — a lista acima reflete o estado da última rodada de   discussão.</w:t>
+        <w:t xml:space="preserve">  cadastro é só formulário de texto, sem anexo. </w:t>
+      </w:r>
+      <w:r>
+        <w:rPr>
+          <w:b/>
+          <w:bCs/>
+        </w:rPr>
+        <w:t xml:space="preserve">Não construído ainda</w:t>
+      </w:r>
+      <w:r>
+        <w:t xml:space="preserve">   porque exige uma decisão de infraestrutura que não é só código: qual   serviço de armazenamento de arquivo usar (S3, R2, Vercel Blob, etc.) e   as credenciais correspondentes — não é algo pra decidir sozinho.</w:t>
+      </w:r>
+    </w:p>
+    <w:p>
+      <w:pPr>
+        <w:pStyle w:val="ListParagraph"/>
+        <w:numPr>
+          <w:ilvl w:val="0"/>
+          <w:numId w:val="1"/>
+        </w:numPr>
+        <w:spacing w:after="60"/>
+      </w:pPr>
+      <w:r>
+        <w:t xml:space="preserve">Nenhum outro gap novo levantado desde a última rodada de discussão.</w:t>
       </w:r>
     </w:p>
     <w:p>
@@ -2328,7 +2310,37 @@
         <w:spacing w:after="150"/>
       </w:pPr>
       <w:r>
-        <w:t xml:space="preserve">  pedidos não distingue "está com você aguardando ação" de "está com o   fornecedor/Tech10 aguardando eles". Levantado na primeira rodada de   gap-analysis, ainda não confirmado como prioridade.</w:t>
+        <w:t xml:space="preserve">  pedidos não distingue "está com você aguardando ação" de "está com o   fornecedor/Tech10 aguardando eles". </w:t>
+      </w:r>
+      <w:r>
+        <w:rPr>
+          <w:b/>
+          <w:bCs/>
+        </w:rPr>
+        <w:t xml:space="preserve">Não construído ainda</w:t>
+      </w:r>
+      <w:r>
+        <w:t xml:space="preserve"> porque o   sistema hoje não tem essa distinção como regra de negócio de verdade:   `avancarEstagioAdesao` (`src/app/adesoes/actions.ts`) deixa </w:t>
+      </w:r>
+      <w:r>
+        <w:rPr>
+          <w:b/>
+          <w:bCs/>
+        </w:rPr>
+        <w:t xml:space="preserve">qualquer   um dos dois lados</w:t>
+      </w:r>
+      <w:r>
+        <w:t xml:space="preserve"> (fornecedor ou órgão) avançar </w:t>
+      </w:r>
+      <w:r>
+        <w:rPr>
+          <w:b/>
+          <w:bCs/>
+        </w:rPr>
+        <w:t xml:space="preserve">qualquer</w:t>
+      </w:r>
+      <w:r>
+        <w:t xml:space="preserve"> estágio   — não existe hoje um conceito de "de quem é a vez" real no sistema. Um   filtro assim precisaria ou (a) só rotular visualmente um "provável   próximo responsável" por estágio, com base no nome de cada estágio (ex.:   `APRESENTADA_ORGAO` sugere ser a vez do órgão emitir ofício), sem mudar   quem pode clicar "avançar"; ou (b) implementar de verdade a trava de   quem pode agir em cada estágio. São duas features bem diferentes —   peço confirmação de qual das duas antes de construir.</w:t>
       </w:r>
     </w:p>
     <w:p>
@@ -2688,7 +2700,54 @@
         <w:spacing w:after="100" w:before="200"/>
       </w:pPr>
       <w:r>
-        <w:t xml:space="preserve">5.2 Gaps identificados, aguardando confirmação pra construir</w:t>
+        <w:t xml:space="preserve">5.2 Requisitos confirmados e já aplicados</w:t>
+      </w:r>
+    </w:p>
+    <w:p>
+      <w:pPr>
+        <w:pStyle w:val="ListParagraph"/>
+        <w:numPr>
+          <w:ilvl w:val="0"/>
+          <w:numId w:val="1"/>
+        </w:numPr>
+        <w:spacing w:after="60"/>
+      </w:pPr>
+      <w:r>
+        <w:rPr>
+          <w:b/>
+          <w:bCs/>
+        </w:rPr>
+        <w:t xml:space="preserve">Sinalização de atas PNCP incompletas</w:t>
+      </w:r>
+      <w:r>
+        <w:t xml:space="preserve"> (2026-09-04) — atas com</w:t>
+      </w:r>
+    </w:p>
+    <w:p>
+      <w:pPr>
+        <w:spacing w:after="150"/>
+      </w:pPr>
+      <w:r>
+        <w:t xml:space="preserve">  `origem = PNCP` e sem fornecedor real identificado (CNPJ placeholder   `00000000000000`) ou sem nenhum item enriquecido agora aparecem com um   selo "PNCP incompleta" e vêm primeiro na fila de "Atas aguardando   moderação" em `/admin`, em vez de se perderem misturadas com o resto.   </w:t>
+      </w:r>
+      <w:r>
+        <w:rPr>
+          <w:b/>
+          <w:bCs/>
+        </w:rPr>
+        <w:t xml:space="preserve">Ainda não construído:</w:t>
+      </w:r>
+      <w:r>
+        <w:t xml:space="preserve"> uma tela de edição pra de fato completar essas   atas (informar o fornecedor certo, adicionar os itens) — hoje o admin só   vê o alerta, mas precisa aprovar/rejeitar como estão ou completar por   fora do sistema.</w:t>
+      </w:r>
+    </w:p>
+    <w:p>
+      <w:pPr>
+        <w:pStyle w:val="Heading2"/>
+        <w:spacing w:after="100" w:before="200"/>
+      </w:pPr>
+      <w:r>
+        <w:t xml:space="preserve">5.3 Gaps identificados, aguardando confirmação pra construir</w:t>
       </w:r>
     </w:p>
     <w:p>
@@ -2717,34 +2776,6 @@
       </w:pPr>
       <w:r>
         <w:t xml:space="preserve">  contas de fornecedor ou órgão.</w:t>
-      </w:r>
-    </w:p>
-    <w:p>
-      <w:pPr>
-        <w:pStyle w:val="ListParagraph"/>
-        <w:numPr>
-          <w:ilvl w:val="0"/>
-          <w:numId w:val="1"/>
-        </w:numPr>
-        <w:spacing w:after="60"/>
-      </w:pPr>
-      <w:r>
-        <w:rPr>
-          <w:b/>
-          <w:bCs/>
-        </w:rPr>
-        <w:t xml:space="preserve">Fila de atas importadas do PNCP incompletas</w:t>
-      </w:r>
-      <w:r>
-        <w:t xml:space="preserve"> — atas importadas sem</w:t>
-      </w:r>
-    </w:p>
-    <w:p>
-      <w:pPr>
-        <w:spacing w:after="150"/>
-      </w:pPr>
-      <w:r>
-        <w:t xml:space="preserve">  fornecedor identificado (fornecedor "a confirmar") ou sem itens   enriquecidos ficam pendentes, mas não há uma tela dedicada pra revisar   e completar esses casos — hoje elas se misturam com a fila normal de   moderação em `/admin`.</w:t>
       </w:r>
     </w:p>
     <w:p>
@@ -2925,6 +2956,34 @@
       </w:pPr>
       <w:r>
         <w:t xml:space="preserve">  construída e revisada (rodada de 7 prompts de correção, 7/7 verificado   ao vivo). Telas 2, 3 e 4 documentadas no estado "parcial" com os gaps   já levantados nas rodadas de discussão anteriores, aguardando   confirmação um de cada vez, conforme o processo acordado.</w:t>
+      </w:r>
+    </w:p>
+    <w:p>
+      <w:pPr>
+        <w:pStyle w:val="ListParagraph"/>
+        <w:numPr>
+          <w:ilvl w:val="0"/>
+          <w:numId w:val="1"/>
+        </w:numPr>
+        <w:spacing w:after="60"/>
+      </w:pPr>
+      <w:r>
+        <w:rPr>
+          <w:b/>
+          <w:bCs/>
+        </w:rPr>
+        <w:t xml:space="preserve">2026-09-04 (mesmo dia, rodada seguinte)</w:t>
+      </w:r>
+      <w:r>
+        <w:t xml:space="preserve"> — Executados os gaps que já</w:t>
+      </w:r>
+    </w:p>
+    <w:p>
+      <w:pPr>
+        <w:spacing w:after="150"/>
+      </w:pPr>
+      <w:r>
+        <w:t xml:space="preserve">  estavam claros o suficiente pra construir sem nova decisão de negócio:   cadastro de ata com múltiplos itens (Tela 2, verificado ao vivo com 3   itens numa mesma ata) e sinalização de atas PNCP incompletas no painel   admin (Tela 4). Dois gaps ficaram explicitamente parados aguardando   decisão do usuário, por dependerem de escolha que não é só código:   upload de documento (Tela 2 — precisa escolher provedor de   armazenamento) e filtro "precisa da sua ação" (Tela 3 — precisa decidir   se é só rótulo informativo ou trava de verdade em   `avancarEstagioAdesao`).</w:t>
       </w:r>
     </w:p>
     <w:sectPr>

</xml_diff>

<commit_message>
Corrige seed pra respeitar a trava de elegibilidade por esfera
Achado do usuário: dado de demonstração não pode contradizer a própria
regra que o sistema aplica de verdade. O seed tinha adesões de município
a atas gerenciadas por estado/federal, que verificarElegibilidadeEsfera
(art. 86 §§3º/8º) recusaria se fossem pedidas pela tela — corrigido pra
cada adesão de demonstração usar um órgão aderente de esfera compatível
com o órgão gerenciador. Banco recriado do zero (seed:limpar + seed)
pra confirmar que passa pela trava de ponta a ponta sem erro.

Também corrige um bug de FK nos dois scripts de limpeza: faltava apagar
DocumentoAta antes de Ata, quebrando a limpeza desde que o upload de
documento foi implementado.

Co-Authored-By: Claude Sonnet 5 <noreply@anthropic.com>
Claude-Session: https://claude.ai/code/session_01PrnhzdCBtHafogpqn4hpiw
</commit_message>
<xml_diff>
--- a/ESCOPO-DO-PROJETO.docx
+++ b/ESCOPO-DO-PROJETO.docx
@@ -261,7 +261,17 @@
         <w:spacing w:after="150"/>
       </w:pPr>
       <w:r>
-        <w:t xml:space="preserve">A trava de quantidade é código, não confiança: `src/lib/saldo.ts` (`verificarAdesao`) é chamada tanto pela ação real de pedido de adesão quanto pelo seed de demonstração — se a conta recusaria um pedido de verdade, o seed também falha, em vez de gravar um estado que o sistema nunca permitiria. A trava de esfera (`verificarElegibilidadeEsfera`) só está ligada na ação real (`solicitarAdesao`) — o seed cria adesão direto no banco (`criarAdesaoProgredida`), sem passar por ela, então o cenário de demonstração tem hoje adesões de município a ata gerenciada por estado que a regra de esfera recusaria se fossem pedidas de verdade pela tela. Não corrigi o seed pra não reescrever o roteiro de demonstração sem confirmar — sinalizando aqui pra não ser um problema escondido.</w:t>
+        <w:t xml:space="preserve">Essas travas são código, não confiança: `src/lib/saldo.ts` (`verificarAdesao`) é chamada tanto pela ação real de pedido de adesão quanto pelo seed de demonstração — se a conta recusaria um pedido de verdade, o seed também falha, em vez de gravar um estado que o sistema nunca permitiria. A trava de esfera (`verificarElegibilidadeEsfera`) só é chamada de fato dentro da ação real (`solicitarAdesao`), já que o seed cria adesão direto no banco (`criarAdesaoProgredida`, sem passar pela ação) — mas o </w:t>
+      </w:r>
+      <w:r>
+        <w:rPr>
+          <w:b/>
+          <w:bCs/>
+        </w:rPr>
+        <w:t xml:space="preserve">dado</w:t>
+      </w:r>
+      <w:r>
+        <w:t xml:space="preserve"> do seed foi corrigido à mão pra respeitar a mesma regra (cada adesão de demonstração usa um órgão aderente de esfera compatível com o órgão gerenciador da ata), depois que o usuário apontou que um dado de demonstração contradizendo a própria regra do sistema não é aceitável.</w:t>
       </w:r>
     </w:p>
     <w:p>
@@ -3182,7 +3192,35 @@
         <w:spacing w:after="150"/>
       </w:pPr>
       <w:r>
-        <w:t xml:space="preserve">  confirmou, com citação exata do texto comentado da Lei 14.133/2021   (art. 86, §§ 3º/4º/5º/6º/7º/8º), que a trava de quantidade (50%/200%)   já implementada estava certa, mas faltava elegibilidade por esfera   federativa (§§ 3º e 8º). Implementado `src/lib/esferas.ts`   (11 testes) e aplicado em `solicitarAdesao`; `Orgao.esfera` virou   `&lt;select&gt;` fixo em vez de texto livre nos dois cadastros. §§ 6º e 7º   (exceções ao teto de 200%) ficaram explicitamente não cobertos —   exigem campo novo no schema que ainda não existe. Seed de demonstração   não foi reescrito e hoje contém adesões que a nova trava recusaria se   fossem pedidas de verdade pela tela — sinalizado, não escondido.</w:t>
+        <w:t xml:space="preserve">  confirmou, com citação exata do texto comentado da Lei 14.133/2021   (art. 86, §§ 3º/4º/5º/6º/7º/8º), que a trava de quantidade (50%/200%)   já implementada estava certa, mas faltava elegibilidade por esfera   federativa (§§ 3º e 8º). Implementado `src/lib/esferas.ts`   (11 testes) e aplicado em `solicitarAdesao`; `Orgao.esfera` virou   `&lt;select&gt;` fixo em vez de texto livre nos dois cadastros. §§ 6º e 7º   (exceções ao teto de 200%) ficaram explicitamente não cobertos —   exigem campo novo no schema que ainda não existe.</w:t>
+      </w:r>
+    </w:p>
+    <w:p>
+      <w:pPr>
+        <w:pStyle w:val="ListParagraph"/>
+        <w:numPr>
+          <w:ilvl w:val="0"/>
+          <w:numId w:val="1"/>
+        </w:numPr>
+        <w:spacing w:after="60"/>
+      </w:pPr>
+      <w:r>
+        <w:rPr>
+          <w:b/>
+          <w:bCs/>
+        </w:rPr>
+        <w:t xml:space="preserve">2026-09-04 (mesmo dia, correção seguinte)</w:t>
+      </w:r>
+      <w:r>
+        <w:t xml:space="preserve"> — Usuário apontou que dado</w:t>
+      </w:r>
+    </w:p>
+    <w:p>
+      <w:pPr>
+        <w:spacing w:after="150"/>
+      </w:pPr>
+      <w:r>
+        <w:t xml:space="preserve">  de demonstração contradizendo a própria regra do sistema não é   aceitável ("se é indevida deve bloquear, óbvio"). Reescritas as   adesões do seed pra cada uma usar um órgão aderente de esfera   compatível com o órgão gerenciador (município só com município,   estado só com estado, federal só com federal ou recebendo de   estado/distrito) — banco recriado do zero (`seed:limpar` + `seed`)   pra confirmar que passa por `verificarAdesao` de ponta a ponta sem   erro. Também corrigido um bug de FK nos dois scripts de limpeza   (`seed-limpar.ts`, `limpar-dados-teste-vazados.ts`): faltava apagar   `DocumentoAta` antes de `Ata`, quebrava a limpeza desde que o anexo de   documento foi implementado.</w:t>
       </w:r>
     </w:p>
     <w:sectPr>

</xml_diff>

<commit_message>
Adiciona gestão de usuários no admin (ativar/desativar conta)
Último gap real das 4 telas principais do escopo: /admin/usuarios
lista fornecedores e órgãos com um badge Ativo/Desativado e um botão
de alternar. Desativar bloqueia login (mensagem clara em vez de deixar
entrar), sem apagar nada — atas, adesões e faturamento existentes
continuam intactos.

Campo novo Fornecedor.ativo/Orgao.ativo (Boolean @default(true)).
Limitação aceita de propósito: sessão já aberta no momento da
desativação não é revogada na hora, expira sozinha em até 7 dias —
revogação imediata exigiria checar `ativo` em toda página autenticada,
mudança mais ampla que fica pra depois.

Co-Authored-By: Claude Sonnet 5 <noreply@anthropic.com>
Claude-Session: https://claude.ai/code/session_01PrnhzdCBtHafogpqn4hpiw
</commit_message>
<xml_diff>
--- a/ESCOPO-DO-PROJETO.docx
+++ b/ESCOPO-DO-PROJETO.docx
@@ -2530,18 +2530,18 @@
           <w:b/>
           <w:bCs/>
         </w:rPr>
-        <w:t xml:space="preserve">Status: 🟡 Parcial</w:t>
-      </w:r>
-      <w:r>
-        <w:t xml:space="preserve"> — fluxo principal existe e funciona; gaps de</w:t>
-      </w:r>
-    </w:p>
-    <w:p>
-      <w:pPr>
-        <w:spacing w:after="150"/>
-      </w:pPr>
-      <w:r>
-        <w:t xml:space="preserve">gestão ainda não construídos.</w:t>
+        <w:t xml:space="preserve">Status: ✅ Construída</w:t>
+      </w:r>
+      <w:r>
+        <w:t xml:space="preserve"> — fluxo principal e todos os gaps levantados</w:t>
+      </w:r>
+    </w:p>
+    <w:p>
+      <w:pPr>
+        <w:spacing w:after="150"/>
+      </w:pPr>
+      <w:r>
+        <w:t xml:space="preserve">até agora já aplicados.</w:t>
       </w:r>
     </w:p>
     <w:p>
@@ -2801,6 +2801,56 @@
           </w:tcPr>
           <w:p>
             <w:r>
+              <w:t xml:space="preserve">`/admin/usuarios`</w:t>
+            </w:r>
+          </w:p>
+        </w:tc>
+        <w:tc>
+          <w:tcPr>
+            <w:tcW w:type="dxa" w:w="3000"/>
+            <w:tcMar>
+              <w:top w:type="dxa" w:w="80"/>
+              <w:left w:type="dxa" w:w="100"/>
+              <w:bottom w:type="dxa" w:w="80"/>
+              <w:right w:type="dxa" w:w="100"/>
+            </w:tcMar>
+          </w:tcPr>
+          <w:p>
+            <w:r>
+              <w:t xml:space="preserve">Gestão de usuários — ativar/desativar fornecedor e órgão</w:t>
+            </w:r>
+          </w:p>
+        </w:tc>
+        <w:tc>
+          <w:tcPr>
+            <w:tcW w:type="dxa" w:w="3000"/>
+            <w:tcMar>
+              <w:top w:type="dxa" w:w="80"/>
+              <w:left w:type="dxa" w:w="100"/>
+              <w:bottom w:type="dxa" w:w="80"/>
+              <w:right w:type="dxa" w:w="100"/>
+            </w:tcMar>
+          </w:tcPr>
+          <w:p>
+            <w:r>
+              <w:t xml:space="preserve">✅ Completo</w:t>
+            </w:r>
+          </w:p>
+        </w:tc>
+      </w:tr>
+      <w:tr>
+        <w:tc>
+          <w:tcPr>
+            <w:tcW w:type="dxa" w:w="3000"/>
+            <w:tcMar>
+              <w:top w:type="dxa" w:w="80"/>
+              <w:left w:type="dxa" w:w="100"/>
+              <w:bottom w:type="dxa" w:w="80"/>
+              <w:right w:type="dxa" w:w="100"/>
+            </w:tcMar>
+          </w:tcPr>
+          <w:p>
+            <w:r>
               <w:t xml:space="preserve">`/atas`</w:t>
             </w:r>
           </w:p>
@@ -2899,15 +2949,6 @@
     </w:p>
     <w:p>
       <w:pPr>
-        <w:pStyle w:val="Heading2"/>
-        <w:spacing w:after="100" w:before="200"/>
-      </w:pPr>
-      <w:r>
-        <w:t xml:space="preserve">5.3 Gaps identificados, aguardando confirmação pra construir</w:t>
-      </w:r>
-    </w:p>
-    <w:p>
-      <w:pPr>
         <w:pStyle w:val="ListParagraph"/>
         <w:numPr>
           <w:ilvl w:val="0"/>
@@ -2923,15 +2964,25 @@
         <w:t xml:space="preserve">Gestão de usuários</w:t>
       </w:r>
       <w:r>
-        <w:t xml:space="preserve"> — hoje não existe tela pra admin listar/desativar</w:t>
-      </w:r>
-    </w:p>
-    <w:p>
-      <w:pPr>
-        <w:spacing w:after="150"/>
-      </w:pPr>
-      <w:r>
-        <w:t xml:space="preserve">  contas de fornecedor ou órgão.</w:t>
+        <w:t xml:space="preserve"> (2026-09-04) — `/admin/usuarios` lista todo</w:t>
+      </w:r>
+    </w:p>
+    <w:p>
+      <w:pPr>
+        <w:spacing w:after="150"/>
+      </w:pPr>
+      <w:r>
+        <w:t xml:space="preserve">  fornecedor e órgão com um badge Ativo/Desativado e um botão de   alternar. Desativar bloqueia login (checado em `loginFornecedor` e   `loginOrgao`, mensagem clara de conta desativada) sem apagar nada —   atas, adesões e faturamento já existentes continuam intactos. Campo   novo: `Fornecedor.ativo` / `Orgao.ativo` (`Boolean @default(true)`).   </w:t>
+      </w:r>
+      <w:r>
+        <w:rPr>
+          <w:b/>
+          <w:bCs/>
+        </w:rPr>
+        <w:t xml:space="preserve">Limitação conhecida, aceita de propósito:</w:t>
+      </w:r>
+      <w:r>
+        <w:t xml:space="preserve"> uma sessão já aberta no   momento da desativação não é revogada na hora — continua valendo até   expirar sozinha (até 7 dias, mesma duração de qualquer sessão). Revogar   na hora exigiria checar `ativo` em toda página autenticada a cada   requisição, não só no login — deixado de fora por ora por ser uma   mudança mais ampla no `src/lib/auth.ts`, não uma decisão de negócio.   Verificado ao vivo com Playwright.</w:t>
       </w:r>
     </w:p>
     <w:p>
@@ -3221,6 +3272,34 @@
       </w:pPr>
       <w:r>
         <w:t xml:space="preserve">  de demonstração contradizendo a própria regra do sistema não é   aceitável ("se é indevida deve bloquear, óbvio"). Reescritas as   adesões do seed pra cada uma usar um órgão aderente de esfera   compatível com o órgão gerenciador (município só com município,   estado só com estado, federal só com federal ou recebendo de   estado/distrito) — banco recriado do zero (`seed:limpar` + `seed`)   pra confirmar que passa por `verificarAdesao` de ponta a ponta sem   erro. Também corrigido um bug de FK nos dois scripts de limpeza   (`seed-limpar.ts`, `limpar-dados-teste-vazados.ts`): faltava apagar   `DocumentoAta` antes de `Ata`, quebrava a limpeza desde que o anexo de   documento foi implementado.</w:t>
+      </w:r>
+    </w:p>
+    <w:p>
+      <w:pPr>
+        <w:pStyle w:val="ListParagraph"/>
+        <w:numPr>
+          <w:ilvl w:val="0"/>
+          <w:numId w:val="1"/>
+        </w:numPr>
+        <w:spacing w:after="60"/>
+      </w:pPr>
+      <w:r>
+        <w:rPr>
+          <w:b/>
+          <w:bCs/>
+        </w:rPr>
+        <w:t xml:space="preserve">2026-09-04 (mesmo dia, próximo passo recomendado e aceito)</w:t>
+      </w:r>
+      <w:r>
+        <w:t xml:space="preserve"> —</w:t>
+      </w:r>
+    </w:p>
+    <w:p>
+      <w:pPr>
+        <w:spacing w:after="150"/>
+      </w:pPr>
+      <w:r>
+        <w:t xml:space="preserve">  Construída a gestão de usuários (`/admin/usuarios`), o último gap   real das 4 telas principais. Tela 4 passa de 🟡 Parcial pra ✅   Construída — as 4 telas do escopo original estão todas construídas   agora. Verificado ao vivo com Playwright.</w:t>
       </w:r>
     </w:p>
     <w:sectPr>

</xml_diff>

<commit_message>
Registra a verificação de prontidão pra deploy no escopo
Migrations testadas do zero num banco vazio, schema confirmado
idêntico ao prisma/schema.prisma, e o README atualizado com passo a
passo de deploy — documentado no escopo pra não se perder.

Co-Authored-By: Claude Sonnet 5 <noreply@anthropic.com>
Claude-Session: https://claude.ai/code/session_01PrnhzdCBtHafogpqn4hpiw
</commit_message>
<xml_diff>
--- a/ESCOPO-DO-PROJETO.docx
+++ b/ESCOPO-DO-PROJETO.docx
@@ -3578,6 +3578,34 @@
       </w:pPr>
       <w:r>
         <w:t xml:space="preserve">  possível fechar sem inventar regra de negócio: perfil/troca de senha   pros 3 perfis autenticados, 404 customizado, central de ajuda/FAQ, e a   tela de completar ata PNCP incompleta (fornecedor real + itens) no   admin. `npm run build` (produção) rodado com sucesso, todas as rotas   novas compilando. Dois itens ficaram de fora, sinalizados e não   escondidos: notificação por e-mail (precisa de provedor de e-mail com   credencial que não temos) e §§6º/7º da Lei 14.133/2021 (exceções ao   teto de 200%, precisam de campo novo no schema que exige decisão de   negócio primeiro — ver §1.2).</w:t>
+      </w:r>
+    </w:p>
+    <w:p>
+      <w:pPr>
+        <w:pStyle w:val="ListParagraph"/>
+        <w:numPr>
+          <w:ilvl w:val="0"/>
+          <w:numId w:val="1"/>
+        </w:numPr>
+        <w:spacing w:after="60"/>
+      </w:pPr>
+      <w:r>
+        <w:rPr>
+          <w:b/>
+          <w:bCs/>
+        </w:rPr>
+        <w:t xml:space="preserve">2026-09-04 (mesmo dia, "o que falta pra rodar")</w:t>
+      </w:r>
+      <w:r>
+        <w:t xml:space="preserve"> — Verificado que o</w:t>
+      </w:r>
+    </w:p>
+    <w:p>
+      <w:pPr>
+        <w:spacing w:after="150"/>
+      </w:pPr>
+      <w:r>
+        <w:t xml:space="preserve">  banco de dados aplica as 10 migrations do zero, num Postgres vazio,   sem erro, e que o schema resultante bate exatamente com   `prisma/schema.prisma` (`prisma migrate diff` vazio) — confirma que um   banco de produção novo (Supabase etc.) vai funcionar de primeira.   Confirmado também que `/api/rastreador-pncp` já está protegido pelo   `CRON_SECRET`. `README.md` ganhou um passo a passo real de deploy em   produção (variáveis de ambiente, migrations, criação do admin,   alerta de nunca rodar o seed de demonstração em produção), no lugar   dos 3 bullets soltos que existiam antes. Fica só faltando o que   depende de contas externas (Supabase, Vercel, Registro.br, e as duas   decisões de negócio já registradas acima).</w:t>
       </w:r>
     </w:p>
     <w:sectPr>

</xml_diff>

<commit_message>
Fecha a decisão de infraestrutura: Vercel + Supabase + domínio à parte
Domínio .com.br pode ser comprado onde for mais conveniente (Hostinger
inclusive) e apontado pra Vercel — são decisões independentes. Descartada
a rota de hospedar tudo na Hostinger porque os planos gerenciados de
Node.js de lá não incluem Postgres gerenciado (banco em VPS exigiria a
equipe cuidar sozinha de backup/segurança, risco desnecessário aqui).

README deixa de listar isso como opção em aberto e passa a documentar
como decisão fechada.

Co-Authored-By: Claude Sonnet 5 <noreply@anthropic.com>
Claude-Session: https://claude.ai/code/session_01PrnhzdCBtHafogpqn4hpiw
</commit_message>
<xml_diff>
--- a/ESCOPO-DO-PROJETO.docx
+++ b/ESCOPO-DO-PROJETO.docx
@@ -3606,6 +3606,44 @@
       </w:pPr>
       <w:r>
         <w:t xml:space="preserve">  banco de dados aplica as 10 migrations do zero, num Postgres vazio,   sem erro, e que o schema resultante bate exatamente com   `prisma/schema.prisma` (`prisma migrate diff` vazio) — confirma que um   banco de produção novo (Supabase etc.) vai funcionar de primeira.   Confirmado também que `/api/rastreador-pncp` já está protegido pelo   `CRON_SECRET`. `README.md` ganhou um passo a passo real de deploy em   produção (variáveis de ambiente, migrations, criação do admin,   alerta de nunca rodar o seed de demonstração em produção), no lugar   dos 3 bullets soltos que existiam antes. Fica só faltando o que   depende de contas externas (Supabase, Vercel, Registro.br, e as duas   decisões de negócio já registradas acima).</w:t>
+      </w:r>
+    </w:p>
+    <w:p>
+      <w:pPr>
+        <w:pStyle w:val="ListParagraph"/>
+        <w:numPr>
+          <w:ilvl w:val="0"/>
+          <w:numId w:val="1"/>
+        </w:numPr>
+        <w:spacing w:after="60"/>
+      </w:pPr>
+      <w:r>
+        <w:rPr>
+          <w:b/>
+          <w:bCs/>
+        </w:rPr>
+        <w:t xml:space="preserve">2026-09-04 (mesmo dia, decisão de infraestrutura fechada)</w:t>
+      </w:r>
+      <w:r>
+        <w:t xml:space="preserve"> —</w:t>
+      </w:r>
+    </w:p>
+    <w:p>
+      <w:pPr>
+        <w:spacing w:after="150"/>
+      </w:pPr>
+      <w:r>
+        <w:t xml:space="preserve">  Avaliada a Hostinger como alternativa a Vercel/Supabase. Decisão:   </w:t>
+      </w:r>
+      <w:r>
+        <w:rPr>
+          <w:b/>
+          <w:bCs/>
+        </w:rPr>
+        <w:t xml:space="preserve">banco no Supabase, aplicação na Vercel, domínio `.com.br` comprado   onde for mais conveniente (Hostinger inclusive) e apontado pra   Vercel</w:t>
+      </w:r>
+      <w:r>
+        <w:t xml:space="preserve">. Motivo de descartar a rota "Hostinger completo" (app +   banco autoadministrado em VPS): os planos gerenciados de Node.js da   Hostinger não incluem Postgres gerenciado — banco em VPS exigiria a   equipe cuidar sozinha de backup e atualização de segurança, risco   desnecessário num sistema que fatura de verdade e não tem equipe de   infraestrutura dedicada. Confirmado que domínio e hospedagem são   decisões independentes: comprar o `.com.br` na Hostinger não impede   (nem tem relação com) hospedar o site na Vercel. `README.md`   atualizado pra registrar essa decisão como definitiva, não mais como   opção em aberto.</w:t>
       </w:r>
     </w:p>
     <w:sectPr>

</xml_diff>

<commit_message>
Adiciona filtro por objeto + cidade na listagem interna de atas (/atas)
A listagem que mostra TODA ata (qualquer status/origem) não tinha filtro
nenhum — era uma lista corrida. Agora dá pra buscar por texto livre do
objeto combinado com a cidade do órgão gerenciador, diferente do filtro
do catálogo público (que só cobre atas aprovadas/vigentes, por tema e UF,
não por município).

Verificado ao vivo com Playwright: 24 atas sem filtro, 2 ao combinar
objeto + cidade, e mensagem clara quando nada bate.

Co-Authored-By: Claude Sonnet 5 <noreply@anthropic.com>
Claude-Session: https://claude.ai/code/session_01PrnhzdCBtHafogpqn4hpiw
</commit_message>
<xml_diff>
--- a/ESCOPO-DO-PROJETO.docx
+++ b/ESCOPO-DO-PROJETO.docx
@@ -3462,6 +3462,34 @@
       </w:pPr>
       <w:r>
         <w:t xml:space="preserve">    raspagem vertical pra portais estaduais/municipais específicos (§3     do mapa) não entrou porque exige decidir fonte por fonte quais     portais valem o esforço, decisão que ninguém tomou ainda; nenhuma     fonte nova foi inventada. O mapa completo, com os cinco blocos e o     que cada um significa, está no artefato publicado separadamente.</w:t>
+      </w:r>
+    </w:p>
+    <w:p>
+      <w:pPr>
+        <w:pStyle w:val="ListParagraph"/>
+        <w:numPr>
+          <w:ilvl w:val="0"/>
+          <w:numId w:val="1"/>
+        </w:numPr>
+        <w:spacing w:after="60"/>
+      </w:pPr>
+      <w:r>
+        <w:rPr>
+          <w:b/>
+          <w:bCs/>
+        </w:rPr>
+        <w:t xml:space="preserve">Filtro por objeto + cidade em `/atas` (2026-09-05)</w:t>
+      </w:r>
+      <w:r>
+        <w:t xml:space="preserve"> — a listagem</w:t>
+      </w:r>
+    </w:p>
+    <w:p>
+      <w:pPr>
+        <w:spacing w:after="150"/>
+      </w:pPr>
+      <w:r>
+        <w:t xml:space="preserve">  interna do admin (mostra TODA ata, qualquer status/origem) não tinha   filtro nenhum até então; era só uma lista corrida. Agora tem uma busca   por texto livre do objeto (`Ata.objeto`) combinada com a cidade do   órgão gerenciador (`Orgao.municipio`) — diferente do filtro do catálogo   público (`/catalogo`), que só filtra atas aprovadas/vigentes por tema e   UF, não por município. Verificado ao vivo: 24 atas sem filtro → 2 ao   combinar objeto + cidade nos dados de desenvolvimento, e mensagem clara   quando o filtro não bate com nada.</w:t>
       </w:r>
     </w:p>
     <w:p>

</xml_diff>